<commit_message>
doc: Project plan and Action plan are created
</commit_message>
<xml_diff>
--- a/Docs/Other/My action plan for next days.docx
+++ b/Docs/Other/My action plan for next days.docx
@@ -15,6 +15,12 @@
         </w:rPr>
         <w:t>Third DL</w:t>
       </w:r>
+      <w:r>
+        <w:rPr>
+          <w:lang w:val="en-US"/>
+        </w:rPr>
+        <w:t xml:space="preserve"> : DONE</w:t>
+      </w:r>
     </w:p>
     <w:p>
       <w:pPr>
@@ -60,7 +66,19 @@
           <w:lang w:val="en-US"/>
         </w:rPr>
         <w:br/>
-        <w:t>- instead of creating a realising document, I will include it to my third decision log which is related to my test.</w:t>
+        <w:t>- instead of creating a</w:t>
+      </w:r>
+      <w:r>
+        <w:rPr>
+          <w:lang w:val="en-US"/>
+        </w:rPr>
+        <w:t>nother</w:t>
+      </w:r>
+      <w:r>
+        <w:rPr>
+          <w:lang w:val="en-US"/>
+        </w:rPr>
+        <w:t xml:space="preserve"> realising document, I will include it to my third decision log which is related to my test.</w:t>
       </w:r>
       <w:r>
         <w:rPr>
@@ -238,6 +256,12 @@
         </w:rPr>
         <w:t>DL</w:t>
       </w:r>
+      <w:r>
+        <w:rPr>
+          <w:rStyle w:val="Heading2Char"/>
+        </w:rPr>
+        <w:t xml:space="preserve"> : DONE</w:t>
+      </w:r>
     </w:p>
     <w:p>
       <w:r>
@@ -272,6 +296,9 @@
       </w:r>
       <w:r>
         <w:t>Replace "feeling more confident" with something measurable</w:t>
+      </w:r>
+      <w:r>
+        <w:t xml:space="preserve"> or remove it since it’s a bit repetative.</w:t>
       </w:r>
     </w:p>
     <w:p/>
@@ -293,6 +320,12 @@
           <w:rStyle w:val="Heading2Char"/>
         </w:rPr>
         <w:t>DL</w:t>
+      </w:r>
+      <w:r>
+        <w:rPr>
+          <w:rStyle w:val="Heading2Char"/>
+        </w:rPr>
+        <w:t xml:space="preserve"> : DONE</w:t>
       </w:r>
     </w:p>
     <w:p>
@@ -1074,6 +1107,7 @@
   <w:style w:type="character" w:default="1" w:styleId="DefaultParagraphFont">
     <w:name w:val="Default Paragraph Font"/>
     <w:uiPriority w:val="1"/>
+    <w:semiHidden/>
     <w:unhideWhenUsed/>
   </w:style>
   <w:style w:type="table" w:default="1" w:styleId="TableNormal">

</xml_diff>